<commit_message>
Update AquiferOpenBibleDictionary content for release 2026-06-23 with multiple languages
</commit_message>
<xml_diff>
--- a/eng/docx/023.content.docx
+++ b/eng/docx/023.content.docx
@@ -21738,7 +21738,7 @@
         <w:rPr>
           <w:lang w:val="en_US" w:bidi="en_US"/>
         </w:rPr>
-        <w:t xml:space="preserve">The Hebrew word “desire” </w:t>
+        <w:t xml:space="preserve">The Hebrew word translated as “desire” </w:t>
       </w:r>
       <w:r>
         <w:rPr>
@@ -21811,7 +21811,7 @@
             <w:color w:val="0000EE"/>
             <w:u w:val="single"/>
           </w:rPr>
-          <w:t>Song of Songs 7:10</w:t>
+          <w:t>Song of Solomon 7:10</w:t>
         </w:r>
       </w:hyperlink>
       <w:r>

</xml_diff>